<commit_message>
Store daily recap Word us_market_recap_2026-10-29_BJT_us_2026-10-28_final
</commit_message>
<xml_diff>
--- a/reports/us_market_recap_2026-10-29_BJT_us_2026-10-28_final.docx
+++ b/reports/us_market_recap_2026-10-29_BJT_us_2026-10-28_final.docx
@@ -1013,7 +1013,7 @@
                 <w:color w:val="141414"/>
                 <w:sz w:val="16"/>
               </w:rPr>
-              <w:t>102.15 / 101.84 / 8.12万美元</w:t>
+              <w:t>102.29 / 102.16 / 8.04万美元</w:t>
             </w:r>
           </w:p>
         </w:tc>
@@ -1040,7 +1040,7 @@
                 <w:color w:val="141414"/>
                 <w:sz w:val="16"/>
               </w:rPr>
-              <w:t>DXY -0.16% / WTI +1.94% / BTC +0.47%</w:t>
+              <w:t>DXY -0.03% / WTI +2.26% / BTC -0.45%</w:t>
             </w:r>
           </w:p>
         </w:tc>
@@ -1533,79 +1533,88 @@
         <w:spacing w:after="120" w:line="276" w:lineRule="auto"/>
       </w:pPr>
       <w:r>
-        <w:t xml:space="preserve">异常个股必须回填在行业图旁：本次扫描得到 </w:t>
+        <w:t xml:space="preserve">异常个股必须回填在行业图旁：本次先从 520 个可用单股样本中按当日绝对涨跌、相对 </w:t>
       </w:r>
       <w:r>
         <w:rPr>
           <w:shd w:fill="E7E6E6"/>
         </w:rPr>
-        <w:t>LITE</w:t>
+        <w:t>SPY</w:t>
       </w:r>
       <w:r>
-        <w:t xml:space="preserve"> +5.52%、</w:t>
+        <w:t>、成交量和新高/新低筛出 10 个候选：</w:t>
+      </w:r>
+      <w:r>
+        <w:t>CRL</w:t>
+      </w:r>
+      <w:r>
+        <w:t>（生命科学工具）+25.07%、</w:t>
+      </w:r>
+      <w:r>
+        <w:t>LMT</w:t>
+      </w:r>
+      <w:r>
+        <w:t>（航空航天/国防）+24.95%、</w:t>
+      </w:r>
+      <w:r>
+        <w:t>HAS</w:t>
+      </w:r>
+      <w:r>
+        <w:t>（可选消费/玩具）+23.70%、</w:t>
+      </w:r>
+      <w:r>
+        <w:t>FFIV</w:t>
+      </w:r>
+      <w:r>
+        <w:t>（网络设备/应用交付）-23.25%、</w:t>
+      </w:r>
+      <w:r>
+        <w:t>PNR</w:t>
+      </w:r>
+      <w:r>
+        <w:t>（S&amp;P 500成分股（行业标签待核））+21.52%、</w:t>
+      </w:r>
+      <w:r>
+        <w:t>TER</w:t>
+      </w:r>
+      <w:r>
+        <w:t>（半导体测试）-17.63%、</w:t>
+      </w:r>
+      <w:r>
+        <w:t>FIX</w:t>
+      </w:r>
+      <w:r>
+        <w:t>（S&amp;P 500成分股（行业标签待核））-17.27%、</w:t>
       </w:r>
       <w:r>
         <w:rPr>
           <w:shd w:fill="E7E6E6"/>
         </w:rPr>
-        <w:t>CIEN</w:t>
+        <w:t>VRT</w:t>
       </w:r>
       <w:r>
-        <w:t xml:space="preserve"> +3.43%、</w:t>
+        <w:t>（数据中心电力/散热）+16.48%、</w:t>
+      </w:r>
+      <w:r>
+        <w:t>SKYD</w:t>
+      </w:r>
+      <w:r>
+        <w:t>（S&amp;P 500成分股（行业标签待核））-16.18%、</w:t>
       </w:r>
       <w:r>
         <w:rPr>
           <w:shd w:fill="E7E6E6"/>
         </w:rPr>
-        <w:t>COHR</w:t>
+        <w:t>HOOD</w:t>
       </w:r>
       <w:r>
-        <w:t xml:space="preserve"> +1.61%、</w:t>
+        <w:t xml:space="preserve">（金融科技/交易平台）-3.31%。固定 </w:t>
       </w:r>
       <w:r>
-        <w:rPr>
-          <w:shd w:fill="E7E6E6"/>
-        </w:rPr>
-        <w:t>AAOI</w:t>
+        <w:t>AI</w:t>
       </w:r>
       <w:r>
-        <w:t xml:space="preserve"> +6.85%、</w:t>
-      </w:r>
-      <w:r>
-        <w:rPr>
-          <w:shd w:fill="E7E6E6"/>
-        </w:rPr>
-        <w:t>CRDO</w:t>
-      </w:r>
-      <w:r>
-        <w:t xml:space="preserve"> +3.74%、</w:t>
-      </w:r>
-      <w:r>
-        <w:rPr>
-          <w:shd w:fill="E7E6E6"/>
-        </w:rPr>
-        <w:t>FICO</w:t>
-      </w:r>
-      <w:r>
-        <w:t xml:space="preserve"> +0.93%、</w:t>
-      </w:r>
-      <w:r>
-        <w:rPr>
-          <w:shd w:fill="E7E6E6"/>
-        </w:rPr>
-        <w:t>FIGS</w:t>
-      </w:r>
-      <w:r>
-        <w:t xml:space="preserve"> +0.88%、</w:t>
-      </w:r>
-      <w:r>
-        <w:rPr>
-          <w:shd w:fill="E7E6E6"/>
-        </w:rPr>
-        <w:t>MDT</w:t>
-      </w:r>
-      <w:r>
-        <w:t xml:space="preserve"> +0.88%。这些是价格/成交异常候选，若当天没有新公告、研报、公司交流或可验证传闻，只能标为结构性重定价或待验，不能把行业 </w:t>
+        <w:t xml:space="preserve">/光通信名单只用于覆盖扫描，未进入当日异动排序的标的不进入本节归因。若当天没有新公告、研报、公司交流或可验证传闻，只能标为结构性重定价或待验，不能把行业 </w:t>
       </w:r>
       <w:r>
         <w:t>ETF</w:t>
@@ -3798,7 +3807,7 @@
                 <w:color w:val="141414"/>
                 <w:sz w:val="16"/>
               </w:rPr>
-              <w:t>VRT</w:t>
+              <w:t>CRL</w:t>
             </w:r>
           </w:p>
         </w:tc>
@@ -3824,7 +3833,7 @@
                 <w:color w:val="141414"/>
                 <w:sz w:val="16"/>
               </w:rPr>
-              <w:t>价格 +16.48%；成交 3.58x均量</w:t>
+              <w:t>生命科学工具；价格 +25.07%；相对SPY +24.72pp；成交不可得</w:t>
             </w:r>
           </w:p>
         </w:tc>
@@ -3851,7 +3860,7 @@
                 <w:color w:val="141414"/>
                 <w:sz w:val="16"/>
               </w:rPr>
-              <w:t>待核验同日增量</w:t>
+              <w:t>top_gainer</w:t>
             </w:r>
           </w:p>
         </w:tc>
@@ -3877,7 +3886,7 @@
                 <w:color w:val="141414"/>
                 <w:sz w:val="16"/>
               </w:rPr>
-              <w:t>先归为公司/行业/因子重定价候选；没有新证据不升级为催化</w:t>
+              <w:t>待核验同日增量；先归为公司/行业/因子重定价候选，不把涨跌倒推成原因</w:t>
             </w:r>
           </w:p>
         </w:tc>
@@ -3909,7 +3918,7 @@
                 <w:color w:val="141414"/>
                 <w:sz w:val="16"/>
               </w:rPr>
-              <w:t>ORCL</w:t>
+              <w:t>LMT</w:t>
             </w:r>
           </w:p>
         </w:tc>
@@ -3935,7 +3944,7 @@
                 <w:color w:val="141414"/>
                 <w:sz w:val="16"/>
               </w:rPr>
-              <w:t>价格 +10.73%；成交 2.73x均量</w:t>
+              <w:t>航空航天/国防；价格 +24.95%；相对SPY +24.60pp；成交不可得</w:t>
             </w:r>
           </w:p>
         </w:tc>
@@ -3962,7 +3971,7 @@
                 <w:color w:val="141414"/>
                 <w:sz w:val="16"/>
               </w:rPr>
-              <w:t>待核验同日增量</w:t>
+              <w:t>top_gainer</w:t>
             </w:r>
           </w:p>
         </w:tc>
@@ -3988,7 +3997,7 @@
                 <w:color w:val="141414"/>
                 <w:sz w:val="16"/>
               </w:rPr>
-              <w:t>先归为公司/行业/因子重定价候选；没有新证据不升级为催化</w:t>
+              <w:t>待核验同日增量；先归为公司/行业/因子重定价候选，不把涨跌倒推成原因</w:t>
             </w:r>
           </w:p>
         </w:tc>
@@ -4020,7 +4029,7 @@
                 <w:color w:val="141414"/>
                 <w:sz w:val="16"/>
               </w:rPr>
-              <w:t>SNDK</w:t>
+              <w:t>HAS</w:t>
             </w:r>
           </w:p>
         </w:tc>
@@ -4046,7 +4055,7 @@
                 <w:color w:val="141414"/>
                 <w:sz w:val="16"/>
               </w:rPr>
-              <w:t>价格 +7.66%；成交 1.06x均量</w:t>
+              <w:t>可选消费/玩具；价格 +23.70%；相对SPY +23.36pp；成交不可得</w:t>
             </w:r>
           </w:p>
         </w:tc>
@@ -4073,7 +4082,7 @@
                 <w:color w:val="141414"/>
                 <w:sz w:val="16"/>
               </w:rPr>
-              <w:t>待核验同日增量</w:t>
+              <w:t>top_gainer</w:t>
             </w:r>
           </w:p>
         </w:tc>
@@ -4099,7 +4108,7 @@
                 <w:color w:val="141414"/>
                 <w:sz w:val="16"/>
               </w:rPr>
-              <w:t>先归为公司/行业/因子重定价候选；没有新证据不升级为催化</w:t>
+              <w:t>待核验同日增量；先归为公司/行业/因子重定价候选，不把涨跌倒推成原因</w:t>
             </w:r>
           </w:p>
         </w:tc>
@@ -4131,7 +4140,7 @@
                 <w:color w:val="141414"/>
                 <w:sz w:val="16"/>
               </w:rPr>
-              <w:t>AAOI</w:t>
+              <w:t>FFIV</w:t>
             </w:r>
           </w:p>
         </w:tc>
@@ -4157,7 +4166,7 @@
                 <w:color w:val="141414"/>
                 <w:sz w:val="16"/>
               </w:rPr>
-              <w:t>价格 +6.85%；成交 1.01x均量</w:t>
+              <w:t>网络设备/应用交付；价格 -23.25%；相对SPY -23.59pp；成交不可得</w:t>
             </w:r>
           </w:p>
         </w:tc>
@@ -4184,7 +4193,7 @@
                 <w:color w:val="141414"/>
                 <w:sz w:val="16"/>
               </w:rPr>
-              <w:t>待核验同日增量</w:t>
+              <w:t>top_decliner</w:t>
             </w:r>
           </w:p>
         </w:tc>
@@ -4210,7 +4219,7 @@
                 <w:color w:val="141414"/>
                 <w:sz w:val="16"/>
               </w:rPr>
-              <w:t>先归为公司/行业/因子重定价候选；没有新证据不升级为催化</w:t>
+              <w:t>待核验同日增量；先归为公司/行业/因子重定价候选，不把涨跌倒推成原因</w:t>
             </w:r>
           </w:p>
         </w:tc>
@@ -4242,7 +4251,7 @@
                 <w:color w:val="141414"/>
                 <w:sz w:val="16"/>
               </w:rPr>
-              <w:t>ARKG</w:t>
+              <w:t>PNR</w:t>
             </w:r>
           </w:p>
         </w:tc>
@@ -4268,7 +4277,7 @@
                 <w:color w:val="141414"/>
                 <w:sz w:val="16"/>
               </w:rPr>
-              <w:t>价格 +6.14%；成交 1.59x均量</w:t>
+              <w:t>S&amp;P 500成分股（行业标签待核）；价格 +21.52%；相对SPY +21.18pp；成交不可得</w:t>
             </w:r>
           </w:p>
         </w:tc>
@@ -4295,7 +4304,7 @@
                 <w:color w:val="141414"/>
                 <w:sz w:val="16"/>
               </w:rPr>
-              <w:t>待核验同日增量</w:t>
+              <w:t>top_gainer</w:t>
             </w:r>
           </w:p>
         </w:tc>
@@ -4321,7 +4330,7 @@
                 <w:color w:val="141414"/>
                 <w:sz w:val="16"/>
               </w:rPr>
-              <w:t>先归为公司/行业/因子重定价候选；没有新证据不升级为催化</w:t>
+              <w:t>待核验同日增量；先归为公司/行业/因子重定价候选，不把涨跌倒推成原因</w:t>
             </w:r>
           </w:p>
         </w:tc>
@@ -4353,7 +4362,7 @@
                 <w:color w:val="141414"/>
                 <w:sz w:val="16"/>
               </w:rPr>
-              <w:t>MU</w:t>
+              <w:t>TER</w:t>
             </w:r>
           </w:p>
         </w:tc>
@@ -4379,7 +4388,7 @@
                 <w:color w:val="141414"/>
                 <w:sz w:val="16"/>
               </w:rPr>
-              <w:t>价格 +5.86%；成交 1.15x均量</w:t>
+              <w:t>半导体测试；价格 -17.63%；相对SPY -17.98pp；成交不可得</w:t>
             </w:r>
           </w:p>
         </w:tc>
@@ -4406,7 +4415,7 @@
                 <w:color w:val="141414"/>
                 <w:sz w:val="16"/>
               </w:rPr>
-              <w:t>待核验同日增量</w:t>
+              <w:t>top_decliner</w:t>
             </w:r>
           </w:p>
         </w:tc>
@@ -4432,7 +4441,7 @@
                 <w:color w:val="141414"/>
                 <w:sz w:val="16"/>
               </w:rPr>
-              <w:t>先归为公司/行业/因子重定价候选；没有新证据不升级为催化</w:t>
+              <w:t>待核验同日增量；先归为公司/行业/因子重定价候选，不把涨跌倒推成原因</w:t>
             </w:r>
           </w:p>
         </w:tc>
@@ -4675,7 +4684,7 @@
       <w:r>
         <w:drawing>
           <wp:inline xmlns:a="http://schemas.openxmlformats.org/drawingml/2006/main" xmlns:pic="http://schemas.openxmlformats.org/drawingml/2006/picture">
-            <wp:extent cx="5806440" cy="3359394"/>
+            <wp:extent cx="5806440" cy="3173666"/>
             <wp:docPr id="16" name="Picture 16"/>
             <wp:cNvGraphicFramePr>
               <a:graphicFrameLocks noChangeAspect="1"/>
@@ -4696,7 +4705,7 @@
                   <pic:spPr>
                     <a:xfrm>
                       <a:off x="0" y="0"/>
-                      <a:ext cx="5806440" cy="3359394"/>
+                      <a:ext cx="5806440" cy="3173666"/>
                     </a:xfrm>
                     <a:prstGeom prst="rect"/>
                   </pic:spPr>
@@ -4887,58 +4896,70 @@
         <w:t xml:space="preserve">异动原因必须逐个核验：按绝对涨跌筛出的候选为 </w:t>
       </w:r>
       <w:r>
+        <w:t>CRL</w:t>
+      </w:r>
+      <w:r>
+        <w:t xml:space="preserve"> +25.07%（生命科学工具）；</w:t>
+      </w:r>
+      <w:r>
+        <w:t>LMT</w:t>
+      </w:r>
+      <w:r>
+        <w:t xml:space="preserve"> +24.95%（航空航天/国防）；</w:t>
+      </w:r>
+      <w:r>
+        <w:t>HAS</w:t>
+      </w:r>
+      <w:r>
+        <w:t xml:space="preserve"> +23.70%（可选消费/玩具）；</w:t>
+      </w:r>
+      <w:r>
+        <w:t>FFIV</w:t>
+      </w:r>
+      <w:r>
+        <w:t xml:space="preserve"> -23.25%（网络设备/应用交付）；</w:t>
+      </w:r>
+      <w:r>
+        <w:t>PNR</w:t>
+      </w:r>
+      <w:r>
+        <w:t xml:space="preserve"> +21.52%（S&amp;P 500成分股（行业标签待核））；</w:t>
+      </w:r>
+      <w:r>
+        <w:t>TER</w:t>
+      </w:r>
+      <w:r>
+        <w:t xml:space="preserve"> -17.63%（半导体测试）；</w:t>
+      </w:r>
+      <w:r>
+        <w:t>FIX</w:t>
+      </w:r>
+      <w:r>
+        <w:t xml:space="preserve"> -17.27%（S&amp;P 500成分股（行业标签待核））；</w:t>
+      </w:r>
+      <w:r>
         <w:rPr>
           <w:shd w:fill="E7E6E6"/>
         </w:rPr>
         <w:t>VRT</w:t>
       </w:r>
       <w:r>
-        <w:t xml:space="preserve"> +16.48%（成交约3.58x均量）；</w:t>
+        <w:t xml:space="preserve"> +16.48%（数据中心电力/散热；成交约3.74x均量）；</w:t>
+      </w:r>
+      <w:r>
+        <w:t>SKYD</w:t>
+      </w:r>
+      <w:r>
+        <w:t xml:space="preserve"> -16.18%（S&amp;P 500成分股（行业标签待核））；</w:t>
       </w:r>
       <w:r>
         <w:rPr>
           <w:shd w:fill="E7E6E6"/>
         </w:rPr>
-        <w:t>ORCL</w:t>
+        <w:t>HOOD</w:t>
       </w:r>
       <w:r>
-        <w:t xml:space="preserve"> +10.73%（成交约2.73x均量）；</w:t>
-      </w:r>
-      <w:r>
-        <w:rPr>
-          <w:shd w:fill="E7E6E6"/>
-        </w:rPr>
-        <w:t>SNDK</w:t>
-      </w:r>
-      <w:r>
-        <w:t xml:space="preserve"> +7.66%（成交约1.06x均量）；</w:t>
-      </w:r>
-      <w:r>
-        <w:rPr>
-          <w:shd w:fill="E7E6E6"/>
-        </w:rPr>
-        <w:t>AAOI</w:t>
-      </w:r>
-      <w:r>
-        <w:t xml:space="preserve"> +6.85%（成交约1.01x均量）；</w:t>
-      </w:r>
-      <w:r>
-        <w:rPr>
-          <w:shd w:fill="E7E6E6"/>
-        </w:rPr>
-        <w:t>ARKG</w:t>
-      </w:r>
-      <w:r>
-        <w:t xml:space="preserve"> +6.14%（成交约1.59x均量）；</w:t>
-      </w:r>
-      <w:r>
-        <w:rPr>
-          <w:shd w:fill="E7E6E6"/>
-        </w:rPr>
-        <w:t>MU</w:t>
-      </w:r>
-      <w:r>
-        <w:t xml:space="preserve"> +5.86%（成交约1.15x均量）。这些名字先记录为价格/成交异常，随后核对同日公告、研报、公司交流、行业数据或传闻原始出处；没有证据时保留“待验”，不把涨跌倒推成原因。</w:t>
+        <w:t xml:space="preserve"> -3.31%（金融科技/交易平台；成交约3.52x均量）。这些名字先记录为价格/成交异常，随后核对同日公告、研报、公司交流、行业数据或传闻原始出处；没有证据时保留“待验”，不把涨跌倒推成原因。</w:t>
       </w:r>
     </w:p>
     <w:p>
@@ -5956,7 +5977,7 @@
       <w:r>
         <w:drawing>
           <wp:inline xmlns:a="http://schemas.openxmlformats.org/drawingml/2006/main" xmlns:pic="http://schemas.openxmlformats.org/drawingml/2006/picture">
-            <wp:extent cx="5806440" cy="2546001"/>
+            <wp:extent cx="5806440" cy="2052388"/>
             <wp:docPr id="23" name="Picture 23"/>
             <wp:cNvGraphicFramePr>
               <a:graphicFrameLocks noChangeAspect="1"/>
@@ -5977,7 +5998,7 @@
                   <pic:spPr>
                     <a:xfrm>
                       <a:off x="0" y="0"/>
-                      <a:ext cx="5806440" cy="2546001"/>
+                      <a:ext cx="5806440" cy="2052388"/>
                     </a:xfrm>
                     <a:prstGeom prst="rect"/>
                   </pic:spPr>
@@ -6009,7 +6030,7 @@
       <w:r>
         <w:drawing>
           <wp:inline xmlns:a="http://schemas.openxmlformats.org/drawingml/2006/main" xmlns:pic="http://schemas.openxmlformats.org/drawingml/2006/picture">
-            <wp:extent cx="5806440" cy="3046428"/>
+            <wp:extent cx="5806440" cy="2986262"/>
             <wp:docPr id="24" name="Picture 24"/>
             <wp:cNvGraphicFramePr>
               <a:graphicFrameLocks noChangeAspect="1"/>
@@ -6030,7 +6051,7 @@
                   <pic:spPr>
                     <a:xfrm>
                       <a:off x="0" y="0"/>
-                      <a:ext cx="5806440" cy="3046428"/>
+                      <a:ext cx="5806440" cy="2986262"/>
                     </a:xfrm>
                     <a:prstGeom prst="rect"/>
                   </pic:spPr>
@@ -6204,7 +6225,7 @@
                 <w:color w:val="141414"/>
                 <w:sz w:val="16"/>
               </w:rPr>
-              <w:t>HOOD</w:t>
+              <w:t>FFIV</w:t>
             </w:r>
           </w:p>
         </w:tc>
@@ -6231,7 +6252,7 @@
                 <w:color w:val="141414"/>
                 <w:sz w:val="16"/>
               </w:rPr>
-              <w:t>-3.31%</w:t>
+              <w:t>网络设备/应用交付 -23.25%</w:t>
             </w:r>
           </w:p>
         </w:tc>
@@ -6257,7 +6278,7 @@
                 <w:color w:val="141414"/>
                 <w:sz w:val="16"/>
               </w:rPr>
-              <w:t>1.93x均量</w:t>
+              <w:t>成交不可得；相对SPY -23.59pp</w:t>
             </w:r>
           </w:p>
         </w:tc>
@@ -6315,7 +6336,7 @@
                 <w:color w:val="141414"/>
                 <w:sz w:val="16"/>
               </w:rPr>
-              <w:t>NOW</w:t>
+              <w:t>TER</w:t>
             </w:r>
           </w:p>
         </w:tc>
@@ -6342,7 +6363,7 @@
                 <w:color w:val="141414"/>
                 <w:sz w:val="16"/>
               </w:rPr>
-              <w:t>-3.00%</w:t>
+              <w:t>半导体测试 -17.63%</w:t>
             </w:r>
           </w:p>
         </w:tc>
@@ -6368,7 +6389,7 @@
                 <w:color w:val="141414"/>
                 <w:sz w:val="16"/>
               </w:rPr>
-              <w:t>2.46x均量</w:t>
+              <w:t>成交不可得；相对SPY -17.98pp</w:t>
             </w:r>
           </w:p>
         </w:tc>
@@ -6426,7 +6447,7 @@
                 <w:color w:val="141414"/>
                 <w:sz w:val="16"/>
               </w:rPr>
-              <w:t>VST</w:t>
+              <w:t>FIX</w:t>
             </w:r>
           </w:p>
         </w:tc>
@@ -6453,7 +6474,7 @@
                 <w:color w:val="141414"/>
                 <w:sz w:val="16"/>
               </w:rPr>
-              <w:t>-2.69%</w:t>
+              <w:t>S&amp;P 500成分股（行业标签待核） -17.27%</w:t>
             </w:r>
           </w:p>
         </w:tc>
@@ -6479,7 +6500,7 @@
                 <w:color w:val="141414"/>
                 <w:sz w:val="16"/>
               </w:rPr>
-              <w:t>0.84x均量</w:t>
+              <w:t>成交不可得；相对SPY -17.61pp</w:t>
             </w:r>
           </w:p>
         </w:tc>
@@ -6537,7 +6558,7 @@
                 <w:color w:val="141414"/>
                 <w:sz w:val="16"/>
               </w:rPr>
-              <w:t>SNAP</w:t>
+              <w:t>SKYD</w:t>
             </w:r>
           </w:p>
         </w:tc>
@@ -6564,7 +6585,7 @@
                 <w:color w:val="141414"/>
                 <w:sz w:val="16"/>
               </w:rPr>
-              <w:t>-1.97%</w:t>
+              <w:t>S&amp;P 500成分股（行业标签待核） -16.18%</w:t>
             </w:r>
           </w:p>
         </w:tc>
@@ -6590,7 +6611,7 @@
                 <w:color w:val="141414"/>
                 <w:sz w:val="16"/>
               </w:rPr>
-              <w:t>0.94x均量</w:t>
+              <w:t>成交不可得；相对SPY -16.53pp</w:t>
             </w:r>
           </w:p>
         </w:tc>
@@ -6648,7 +6669,7 @@
                 <w:color w:val="141414"/>
                 <w:sz w:val="16"/>
               </w:rPr>
-              <w:t>PANW</w:t>
+              <w:t>HOOD</w:t>
             </w:r>
           </w:p>
         </w:tc>
@@ -6675,7 +6696,7 @@
                 <w:color w:val="141414"/>
                 <w:sz w:val="16"/>
               </w:rPr>
-              <w:t>-1.79%</w:t>
+              <w:t>金融科技/交易平台 -3.31%</w:t>
             </w:r>
           </w:p>
         </w:tc>
@@ -6701,118 +6722,7 @@
                 <w:color w:val="141414"/>
                 <w:sz w:val="16"/>
               </w:rPr>
-              <w:t>0.78x均量</w:t>
-            </w:r>
-          </w:p>
-        </w:tc>
-        <w:tc>
-          <w:tcPr>
-            <w:tcW w:type="dxa" w:w="4320"/>
-            <w:vAlign w:val="center"/>
-            <w:shd w:fill="FFFFFF"/>
-            <w:tcMar>
-              <w:top w:w="90" w:type="dxa"/>
-              <w:start w:w="90" w:type="dxa"/>
-              <w:bottom w:w="90" w:type="dxa"/>
-              <w:end w:w="90" w:type="dxa"/>
-            </w:tcMar>
-          </w:tcPr>
-          <w:p>
-            <w:pPr>
-              <w:spacing w:before="60" w:after="60" w:line="240" w:lineRule="auto"/>
-            </w:pPr>
-            <w:r>
-              <w:rPr>
-                <w:b w:val="0"/>
-                <w:color w:val="141414"/>
-                <w:sz w:val="16"/>
-              </w:rPr>
-              <w:t>当日价格/成交异常；需用同日公告、研报、交流或产业数据确认原因</w:t>
-            </w:r>
-          </w:p>
-        </w:tc>
-      </w:tr>
-      <w:tr>
-        <w:trPr>
-          <w:cantSplit/>
-        </w:trPr>
-        <w:tc>
-          <w:tcPr>
-            <w:tcW w:type="dxa" w:w="1440"/>
-            <w:vAlign w:val="center"/>
-            <w:shd w:fill="FFFFFF"/>
-            <w:tcMar>
-              <w:top w:w="90" w:type="dxa"/>
-              <w:start w:w="90" w:type="dxa"/>
-              <w:bottom w:w="90" w:type="dxa"/>
-              <w:end w:w="90" w:type="dxa"/>
-            </w:tcMar>
-          </w:tcPr>
-          <w:p>
-            <w:pPr>
-              <w:spacing w:before="60" w:after="60" w:line="240" w:lineRule="auto"/>
-              <w:jc w:val="center"/>
-            </w:pPr>
-            <w:r>
-              <w:rPr>
-                <w:b w:val="0"/>
-                <w:color w:val="141414"/>
-                <w:sz w:val="16"/>
-              </w:rPr>
-              <w:t>VZ</w:t>
-            </w:r>
-          </w:p>
-        </w:tc>
-        <w:tc>
-          <w:tcPr>
-            <w:tcW w:type="dxa" w:w="1440"/>
-            <w:vAlign w:val="center"/>
-            <w:shd w:fill="FFFFFF"/>
-            <w:tcMar>
-              <w:top w:w="90" w:type="dxa"/>
-              <w:start w:w="90" w:type="dxa"/>
-              <w:bottom w:w="90" w:type="dxa"/>
-              <w:end w:w="90" w:type="dxa"/>
-            </w:tcMar>
-          </w:tcPr>
-          <w:p>
-            <w:pPr>
-              <w:spacing w:before="60" w:after="60" w:line="240" w:lineRule="auto"/>
-              <w:jc w:val="center"/>
-            </w:pPr>
-            <w:r>
-              <w:rPr>
-                <w:b w:val="0"/>
-                <w:color w:val="141414"/>
-                <w:sz w:val="16"/>
-              </w:rPr>
-              <w:t>-1.71%</w:t>
-            </w:r>
-          </w:p>
-        </w:tc>
-        <w:tc>
-          <w:tcPr>
-            <w:tcW w:type="dxa" w:w="1944"/>
-            <w:vAlign w:val="center"/>
-            <w:shd w:fill="FFFFFF"/>
-            <w:tcMar>
-              <w:top w:w="90" w:type="dxa"/>
-              <w:start w:w="90" w:type="dxa"/>
-              <w:bottom w:w="90" w:type="dxa"/>
-              <w:end w:w="90" w:type="dxa"/>
-            </w:tcMar>
-          </w:tcPr>
-          <w:p>
-            <w:pPr>
-              <w:spacing w:before="60" w:after="60" w:line="240" w:lineRule="auto"/>
-            </w:pPr>
-            <w:r>
-              <w:rPr>
-                <w:b w:val="0"/>
-                <w:color w:val="141414"/>
-                <w:sz w:val="16"/>
-              </w:rPr>
-              <w:t>0.90x均量</w:t>
+              <w:t>3.52x均量；相对SPY -3.65pp</w:t>
             </w:r>
           </w:p>
         </w:tc>
@@ -9221,7 +9131,7 @@
           <w:color w:val="555555"/>
           <w:sz w:val="17"/>
         </w:rPr>
-        <w:t>图：公开期权链异常扫描。来源/口径：Nasdaq public option-chain endpoint；检查时点 2026-10-28T19:53:20-04:00；无执行方向确认。。</w:t>
+        <w:t>图：公开期权链异常扫描。来源/口径：Nasdaq public option-chain endpoint；检查时点 2026-10-28T20:44:04-04:00；无执行方向确认。。</w:t>
       </w:r>
     </w:p>
     <w:p>

</xml_diff>